<commit_message>
Versão com melhorias no layout e sistema de preventivas
</commit_message>
<xml_diff>
--- a/controle/docs_templates/termos/TEMPLATE BRANCO - Termo_de_Entrega.docx
+++ b/controle/docs_templates/termos/TEMPLATE BRANCO - Termo_de_Entrega.docx
@@ -67,7 +67,7 @@
           <w:rFonts w:asciiTheme="minorHAnsi" w:eastAsia="Calibri" w:hAnsiTheme="minorHAnsi" w:cstheme="minorHAnsi"/>
           <w:color w:val="000000"/>
         </w:rPr>
-        <w:t>__, portador(a) de cédula de identidade RG nº ________________________________________________e inscrito no CPF/MF nº _____________________________ de agora em diante chamado de USUÁRIO, declaro que recebi, li e entendi as obrigações desse Termo de Responsabilidade pela Guarda e Uso de Equipamentos Corporativos da SANTA COLOMBA (Termo) e me comprometo, de forma irretratável com as regras e obrigações abaixo:</w:t>
+        <w:t>__, portador(a) de cédula de identidade RG nº ________________________________________________e inscrito no CPF/MF nº _____________________________, declaro que recebi, li e entendi as obrigações desse Termo de Responsabilidade pela Guarda e Uso de Equipamentos Corporativos da SANTA COLOMBA (Termo) e me comprometo, de forma irretratável com as regras e obrigações abaixo:</w:t>
       </w:r>
     </w:p>
     <w:p>
@@ -382,23 +382,13 @@
         </w:rPr>
         <w:t xml:space="preserve">Em caso de roubo ou furto ocorrido em situações que estejam em desacordo com as regras de uso desse Termo, nas quais o Usuário tenha assumido o risco de transportar os equipamentos da empresa em locais e situações não relacionadas ao trabalho (tais como festas, jogos e competições esportivas, </w:t>
       </w:r>
-      <w:proofErr w:type="spellStart"/>
       <w:r>
         <w:rPr>
           <w:rFonts w:asciiTheme="minorHAnsi" w:eastAsia="Calibri" w:hAnsiTheme="minorHAnsi" w:cstheme="minorHAnsi"/>
           <w:i/>
           <w:color w:val="000000"/>
         </w:rPr>
-        <w:t>happy</w:t>
-      </w:r>
-      <w:proofErr w:type="spellEnd"/>
-      <w:r>
-        <w:rPr>
-          <w:rFonts w:asciiTheme="minorHAnsi" w:eastAsia="Calibri" w:hAnsiTheme="minorHAnsi" w:cstheme="minorHAnsi"/>
-          <w:i/>
-          <w:color w:val="000000"/>
-        </w:rPr>
-        <w:t xml:space="preserve"> hours, </w:t>
+        <w:t xml:space="preserve">happy hours, </w:t>
       </w:r>
       <w:r>
         <w:rPr>
@@ -496,23 +486,7 @@
           <w:rFonts w:asciiTheme="minorHAnsi" w:eastAsia="Calibri" w:hAnsiTheme="minorHAnsi" w:cstheme="minorHAnsi"/>
           <w:color w:val="000000"/>
         </w:rPr>
-        <w:t xml:space="preserve">O Usuário não poderá deixar de informar a ocorrência de violações ou condutas ilícitas praticadas por outras pessoas em relação aos equipamentos da SANTA COLOMBA e, está devidamente </w:t>
-      </w:r>
-      <w:proofErr w:type="spellStart"/>
-      <w:r>
-        <w:rPr>
-          <w:rFonts w:asciiTheme="minorHAnsi" w:eastAsia="Calibri" w:hAnsiTheme="minorHAnsi" w:cstheme="minorHAnsi"/>
-          <w:color w:val="000000"/>
-        </w:rPr>
-        <w:t>informado</w:t>
-      </w:r>
-      <w:proofErr w:type="spellEnd"/>
-      <w:r>
-        <w:rPr>
-          <w:rFonts w:asciiTheme="minorHAnsi" w:eastAsia="Calibri" w:hAnsiTheme="minorHAnsi" w:cstheme="minorHAnsi"/>
-          <w:color w:val="000000"/>
-        </w:rPr>
-        <w:t xml:space="preserve"> de que, caso não atenda às regras desse Termo poderá sofrer penalidades, além do desconto de valores diretos na folha de pagamento, de acordo com os limites legais.</w:t>
+        <w:t>O Usuário não poderá deixar de informar a ocorrência de violações ou condutas ilícitas praticadas por outras pessoas em relação aos equipamentos da SANTA COLOMBA e, está devidamente informado de que, caso não atenda às regras desse Termo poderá sofrer penalidades, além do desconto de valores diretos na folha de pagamento, de acordo com os limites legais.</w:t>
       </w:r>
     </w:p>
     <w:p>
@@ -1170,10 +1144,7 @@
               </w:rPr>
             </w:pPr>
             <w:r>
-              <w:t xml:space="preserve">E2222HS | Modelo: E2222HS | Marca: DELL | Centro de Custo: </w:t>
-            </w:r>
-            <w:r>
-              <w:t>PLANEJAMENTO AGRICOLA</w:t>
+              <w:t>E2222HS | Modelo: E2222HS | Marca: DELL | Centro de Custo: PLANEJAMENTO AGRICOLA</w:t>
             </w:r>
           </w:p>
         </w:tc>
@@ -1992,7 +1963,6 @@
                 <w:color w:val="000000"/>
               </w:rPr>
             </w:pPr>
-            <w:proofErr w:type="gramStart"/>
             <w:r>
               <w:rPr>
                 <w:rFonts w:asciiTheme="minorHAnsi" w:eastAsia="Times New Roman" w:hAnsiTheme="minorHAnsi" w:cstheme="minorHAnsi"/>
@@ -2000,9 +1970,8 @@
                 <w:bCs/>
                 <w:color w:val="000000"/>
               </w:rPr>
-              <w:t>(  )</w:t>
+              <w:t>(  ) Rio do Meio  (</w:t>
             </w:r>
-            <w:proofErr w:type="gramEnd"/>
             <w:r>
               <w:rPr>
                 <w:rFonts w:asciiTheme="minorHAnsi" w:eastAsia="Times New Roman" w:hAnsiTheme="minorHAnsi" w:cstheme="minorHAnsi"/>
@@ -2010,9 +1979,8 @@
                 <w:bCs/>
                 <w:color w:val="000000"/>
               </w:rPr>
-              <w:t xml:space="preserve"> Rio do </w:t>
+              <w:t>x</w:t>
             </w:r>
-            <w:proofErr w:type="gramStart"/>
             <w:r>
               <w:rPr>
                 <w:rFonts w:asciiTheme="minorHAnsi" w:eastAsia="Times New Roman" w:hAnsiTheme="minorHAnsi" w:cstheme="minorHAnsi"/>
@@ -2020,7 +1988,7 @@
                 <w:bCs/>
                 <w:color w:val="000000"/>
               </w:rPr>
-              <w:t>Meio  (</w:t>
+              <w:t xml:space="preserve"> </w:t>
             </w:r>
             <w:r>
               <w:rPr>
@@ -2029,7 +1997,7 @@
                 <w:bCs/>
                 <w:color w:val="000000"/>
               </w:rPr>
-              <w:t>x</w:t>
+              <w:t>) Karitel  (  ) S</w:t>
             </w:r>
             <w:r>
               <w:rPr>
@@ -2038,7 +2006,7 @@
                 <w:bCs/>
                 <w:color w:val="000000"/>
               </w:rPr>
-              <w:t xml:space="preserve"> </w:t>
+              <w:t xml:space="preserve">ão </w:t>
             </w:r>
             <w:r>
               <w:rPr>
@@ -2047,86 +2015,7 @@
                 <w:bCs/>
                 <w:color w:val="000000"/>
               </w:rPr>
-              <w:t>)</w:t>
-            </w:r>
-            <w:proofErr w:type="gramEnd"/>
-            <w:r>
-              <w:rPr>
-                <w:rFonts w:asciiTheme="minorHAnsi" w:eastAsia="Times New Roman" w:hAnsiTheme="minorHAnsi" w:cstheme="minorHAnsi"/>
-                <w:b/>
-                <w:bCs/>
-                <w:color w:val="000000"/>
-              </w:rPr>
-              <w:t xml:space="preserve"> </w:t>
-            </w:r>
-            <w:proofErr w:type="gramStart"/>
-            <w:r>
-              <w:rPr>
-                <w:rFonts w:asciiTheme="minorHAnsi" w:eastAsia="Times New Roman" w:hAnsiTheme="minorHAnsi" w:cstheme="minorHAnsi"/>
-                <w:b/>
-                <w:bCs/>
-                <w:color w:val="000000"/>
-              </w:rPr>
-              <w:t>Karitel  (  )</w:t>
-            </w:r>
-            <w:proofErr w:type="gramEnd"/>
-            <w:r>
-              <w:rPr>
-                <w:rFonts w:asciiTheme="minorHAnsi" w:eastAsia="Times New Roman" w:hAnsiTheme="minorHAnsi" w:cstheme="minorHAnsi"/>
-                <w:b/>
-                <w:bCs/>
-                <w:color w:val="000000"/>
-              </w:rPr>
-              <w:t xml:space="preserve"> S</w:t>
-            </w:r>
-            <w:r>
-              <w:rPr>
-                <w:rFonts w:asciiTheme="minorHAnsi" w:eastAsia="Times New Roman" w:hAnsiTheme="minorHAnsi" w:cstheme="minorHAnsi"/>
-                <w:b/>
-                <w:bCs/>
-                <w:color w:val="000000"/>
-              </w:rPr>
-              <w:t xml:space="preserve">ão </w:t>
-            </w:r>
-            <w:proofErr w:type="gramStart"/>
-            <w:r>
-              <w:rPr>
-                <w:rFonts w:asciiTheme="minorHAnsi" w:eastAsia="Times New Roman" w:hAnsiTheme="minorHAnsi" w:cstheme="minorHAnsi"/>
-                <w:b/>
-                <w:bCs/>
-                <w:color w:val="000000"/>
-              </w:rPr>
-              <w:t>Paulo  (  )</w:t>
-            </w:r>
-            <w:proofErr w:type="gramEnd"/>
-            <w:r>
-              <w:rPr>
-                <w:rFonts w:asciiTheme="minorHAnsi" w:eastAsia="Times New Roman" w:hAnsiTheme="minorHAnsi" w:cstheme="minorHAnsi"/>
-                <w:b/>
-                <w:bCs/>
-                <w:color w:val="000000"/>
-              </w:rPr>
-              <w:t xml:space="preserve"> </w:t>
-            </w:r>
-            <w:proofErr w:type="spellStart"/>
-            <w:r>
-              <w:rPr>
-                <w:rFonts w:asciiTheme="minorHAnsi" w:eastAsia="Times New Roman" w:hAnsiTheme="minorHAnsi" w:cstheme="minorHAnsi"/>
-                <w:b/>
-                <w:bCs/>
-                <w:color w:val="000000"/>
-              </w:rPr>
-              <w:t>Sta.Edwiges</w:t>
-            </w:r>
-            <w:proofErr w:type="spellEnd"/>
-            <w:r>
-              <w:rPr>
-                <w:rFonts w:asciiTheme="minorHAnsi" w:eastAsia="Times New Roman" w:hAnsiTheme="minorHAnsi" w:cstheme="minorHAnsi"/>
-                <w:b/>
-                <w:bCs/>
-                <w:color w:val="000000"/>
-              </w:rPr>
-              <w:t xml:space="preserve">  </w:t>
+              <w:t xml:space="preserve">Paulo  (  ) Sta.Edwiges  </w:t>
             </w:r>
           </w:p>
         </w:tc>
@@ -2175,7 +2064,6 @@
                 <w:color w:val="000000"/>
               </w:rPr>
             </w:pPr>
-            <w:proofErr w:type="spellStart"/>
             <w:r>
               <w:rPr>
                 <w:rFonts w:asciiTheme="minorHAnsi" w:eastAsia="Times New Roman" w:hAnsiTheme="minorHAnsi" w:cstheme="minorHAnsi"/>
@@ -2192,17 +2080,7 @@
                 <w:bCs/>
                 <w:color w:val="000000"/>
               </w:rPr>
-              <w:t>ENTREGA</w:t>
-            </w:r>
-            <w:proofErr w:type="spellEnd"/>
-            <w:r>
-              <w:rPr>
-                <w:rFonts w:asciiTheme="minorHAnsi" w:eastAsia="Times New Roman" w:hAnsiTheme="minorHAnsi" w:cstheme="minorHAnsi"/>
-                <w:b/>
-                <w:bCs/>
-                <w:color w:val="000000"/>
-              </w:rPr>
-              <w:t xml:space="preserve"> DE MONITOR / NOVO</w:t>
+              <w:t>ENTREGA DE MONITOR / NOVO</w:t>
             </w:r>
           </w:p>
         </w:tc>

</xml_diff>